<commit_message>
Completed MOVICS baseline analysis
</commit_message>
<xml_diff>
--- a/Results/MOVICS_baseline/TABLE Independent test between subtype and mutation.docx
+++ b/Results/MOVICS_baseline/TABLE Independent test between subtype and mutation.docx
@@ -68,16 +68,6 @@
               <w:pStyle w:stlname="Normal" w:val="Normal"/>
             </w:pPr>
             <w:r>
-              <w:t>CS3</w:t>
-            </w:r>
-          </w:p>
-        </w:tc>
-        <w:tc>
-          <w:p>
-            <w:pPr>
-              <w:pStyle w:stlname="Normal" w:val="Normal"/>
-            </w:pPr>
-            <w:r>
               <w:t>pvalue</w:t>
             </w:r>
           </w:p>
@@ -120,47 +110,37 @@
               <w:pStyle w:stlname="Normal" w:val="Normal"/>
             </w:pPr>
             <w:r>
-              <w:t>44 (9.4%)</w:t>
-            </w:r>
-          </w:p>
-        </w:tc>
-        <w:tc>
-          <w:p>
-            <w:pPr>
-              <w:pStyle w:stlname="Normal" w:val="Normal"/>
-            </w:pPr>
-            <w:r>
-              <w:t>5 (3.1%)</w:t>
-            </w:r>
-          </w:p>
-        </w:tc>
-        <w:tc>
-          <w:p>
-            <w:pPr>
-              <w:pStyle w:stlname="Normal" w:val="Normal"/>
-            </w:pPr>
-            <w:r>
-              <w:t>1 (6.7%)</w:t>
-            </w:r>
-          </w:p>
-        </w:tc>
-        <w:tc>
-          <w:p>
-            <w:pPr>
-              <w:pStyle w:stlname="Normal" w:val="Normal"/>
-            </w:pPr>
-            <w:r>
-              <w:t>2.37e-02</w:t>
-            </w:r>
-          </w:p>
-        </w:tc>
-        <w:tc>
-          <w:p>
-            <w:pPr>
-              <w:pStyle w:stlname="Normal" w:val="Normal"/>
-            </w:pPr>
-            <w:r>
-              <w:t>5.92e-02</w:t>
+              <w:t>15 (6.1%)</w:t>
+            </w:r>
+          </w:p>
+        </w:tc>
+        <w:tc>
+          <w:p>
+            <w:pPr>
+              <w:pStyle w:stlname="Normal" w:val="Normal"/>
+            </w:pPr>
+            <w:r>
+              <w:t>35 (9.2%)</w:t>
+            </w:r>
+          </w:p>
+        </w:tc>
+        <w:tc>
+          <w:p>
+            <w:pPr>
+              <w:pStyle w:stlname="Normal" w:val="Normal"/>
+            </w:pPr>
+            <w:r>
+              <w:t>2.26e-01</w:t>
+            </w:r>
+          </w:p>
+        </w:tc>
+        <w:tc>
+          <w:p>
+            <w:pPr>
+              <w:pStyle w:stlname="Normal" w:val="Normal"/>
+            </w:pPr>
+            <w:r>
+              <w:t>5.65e-01</w:t>
             </w:r>
           </w:p>
         </w:tc>
@@ -182,57 +162,47 @@
               <w:pStyle w:stlname="Normal" w:val="Normal"/>
             </w:pPr>
             <w:r>
-              <w:t>35 ( 5%)</w:t>
-            </w:r>
-          </w:p>
-        </w:tc>
-        <w:tc>
-          <w:p>
-            <w:pPr>
-              <w:pStyle w:stlname="Normal" w:val="Normal"/>
-            </w:pPr>
-            <w:r>
-              <w:t>19 ( 4.1%)</w:t>
-            </w:r>
-          </w:p>
-        </w:tc>
-        <w:tc>
-          <w:p>
-            <w:pPr>
-              <w:pStyle w:stlname="Normal" w:val="Normal"/>
-            </w:pPr>
-            <w:r>
-              <w:t>13 ( 8.1%)</w:t>
-            </w:r>
-          </w:p>
-        </w:tc>
-        <w:tc>
-          <w:p>
-            <w:pPr>
-              <w:pStyle w:stlname="Normal" w:val="Normal"/>
-            </w:pPr>
-            <w:r>
-              <w:t>3 (20.0%)</w:t>
-            </w:r>
-          </w:p>
-        </w:tc>
-        <w:tc>
-          <w:p>
-            <w:pPr>
-              <w:pStyle w:stlname="Normal" w:val="Normal"/>
-            </w:pPr>
-            <w:r>
-              <w:t>9.42e-03</w:t>
-            </w:r>
-          </w:p>
-        </w:tc>
-        <w:tc>
-          <w:p>
-            <w:pPr>
-              <w:pStyle w:stlname="Normal" w:val="Normal"/>
-            </w:pPr>
-            <w:r>
-              <w:t>3.14e-02</w:t>
+              <w:t>34 ( 5%)</w:t>
+            </w:r>
+          </w:p>
+        </w:tc>
+        <w:tc>
+          <w:p>
+            <w:pPr>
+              <w:pStyle w:stlname="Normal" w:val="Normal"/>
+            </w:pPr>
+            <w:r>
+              <w:t>14 (5.7%)</w:t>
+            </w:r>
+          </w:p>
+        </w:tc>
+        <w:tc>
+          <w:p>
+            <w:pPr>
+              <w:pStyle w:stlname="Normal" w:val="Normal"/>
+            </w:pPr>
+            <w:r>
+              <w:t>20 (5.2%)</w:t>
+            </w:r>
+          </w:p>
+        </w:tc>
+        <w:tc>
+          <w:p>
+            <w:pPr>
+              <w:pStyle w:stlname="Normal" w:val="Normal"/>
+            </w:pPr>
+            <w:r>
+              <w:t>8.57e-01</w:t>
+            </w:r>
+          </w:p>
+        </w:tc>
+        <w:tc>
+          <w:p>
+            <w:pPr>
+              <w:pStyle w:stlname="Normal" w:val="Normal"/>
+            </w:pPr>
+            <w:r>
+              <w:t>9.90e-01</w:t>
             </w:r>
           </w:p>
         </w:tc>
@@ -254,57 +224,47 @@
               <w:pStyle w:stlname="Normal" w:val="Normal"/>
             </w:pPr>
             <w:r>
-              <w:t>36 ( 6%)</w:t>
-            </w:r>
-          </w:p>
-        </w:tc>
-        <w:tc>
-          <w:p>
-            <w:pPr>
-              <w:pStyle w:stlname="Normal" w:val="Normal"/>
-            </w:pPr>
-            <w:r>
-              <w:t>25 (5.3%)</w:t>
-            </w:r>
-          </w:p>
-        </w:tc>
-        <w:tc>
-          <w:p>
-            <w:pPr>
-              <w:pStyle w:stlname="Normal" w:val="Normal"/>
-            </w:pPr>
-            <w:r>
-              <w:t>10 (6.2%)</w:t>
-            </w:r>
-          </w:p>
-        </w:tc>
-        <w:tc>
-          <w:p>
-            <w:pPr>
-              <w:pStyle w:stlname="Normal" w:val="Normal"/>
-            </w:pPr>
-            <w:r>
-              <w:t>1 (6.7%)</w:t>
-            </w:r>
-          </w:p>
-        </w:tc>
-        <w:tc>
-          <w:p>
-            <w:pPr>
-              <w:pStyle w:stlname="Normal" w:val="Normal"/>
-            </w:pPr>
-            <w:r>
-              <w:t>6.96e-01</w:t>
-            </w:r>
-          </w:p>
-        </w:tc>
-        <w:tc>
-          <w:p>
-            <w:pPr>
-              <w:pStyle w:stlname="Normal" w:val="Normal"/>
-            </w:pPr>
-            <w:r>
-              <w:t>6.96e-01</w:t>
+              <w:t>34 ( 5%)</w:t>
+            </w:r>
+          </w:p>
+        </w:tc>
+        <w:tc>
+          <w:p>
+            <w:pPr>
+              <w:pStyle w:stlname="Normal" w:val="Normal"/>
+            </w:pPr>
+            <w:r>
+              <w:t>11 (4.5%)</w:t>
+            </w:r>
+          </w:p>
+        </w:tc>
+        <w:tc>
+          <w:p>
+            <w:pPr>
+              <w:pStyle w:stlname="Normal" w:val="Normal"/>
+            </w:pPr>
+            <w:r>
+              <w:t>23 (6.0%)</w:t>
+            </w:r>
+          </w:p>
+        </w:tc>
+        <w:tc>
+          <w:p>
+            <w:pPr>
+              <w:pStyle w:stlname="Normal" w:val="Normal"/>
+            </w:pPr>
+            <w:r>
+              <w:t>4.73e-01</w:t>
+            </w:r>
+          </w:p>
+        </w:tc>
+        <w:tc>
+          <w:p>
+            <w:pPr>
+              <w:pStyle w:stlname="Normal" w:val="Normal"/>
+            </w:pPr>
+            <w:r>
+              <w:t>7.88e-01</w:t>
             </w:r>
           </w:p>
         </w:tc>
@@ -326,57 +286,47 @@
               <w:pStyle w:stlname="Normal" w:val="Normal"/>
             </w:pPr>
             <w:r>
-              <w:t>45 ( 7%)</w:t>
-            </w:r>
-          </w:p>
-        </w:tc>
-        <w:tc>
-          <w:p>
-            <w:pPr>
-              <w:pStyle w:stlname="Normal" w:val="Normal"/>
-            </w:pPr>
-            <w:r>
-              <w:t>37 (7.9%)</w:t>
-            </w:r>
-          </w:p>
-        </w:tc>
-        <w:tc>
-          <w:p>
-            <w:pPr>
-              <w:pStyle w:stlname="Normal" w:val="Normal"/>
-            </w:pPr>
-            <w:r>
-              <w:t>7 (4.4%)</w:t>
-            </w:r>
-          </w:p>
-        </w:tc>
-        <w:tc>
-          <w:p>
-            <w:pPr>
-              <w:pStyle w:stlname="Normal" w:val="Normal"/>
-            </w:pPr>
-            <w:r>
-              <w:t>1 (6.7%)</w:t>
-            </w:r>
-          </w:p>
-        </w:tc>
-        <w:tc>
-          <w:p>
-            <w:pPr>
-              <w:pStyle w:stlname="Normal" w:val="Normal"/>
-            </w:pPr>
-            <w:r>
-              <w:t>2.64e-01</w:t>
-            </w:r>
-          </w:p>
-        </w:tc>
-        <w:tc>
-          <w:p>
-            <w:pPr>
-              <w:pStyle w:stlname="Normal" w:val="Normal"/>
-            </w:pPr>
-            <w:r>
-              <w:t>3.46e-01</w:t>
+              <w:t>43 ( 7%)</w:t>
+            </w:r>
+          </w:p>
+        </w:tc>
+        <w:tc>
+          <w:p>
+            <w:pPr>
+              <w:pStyle w:stlname="Normal" w:val="Normal"/>
+            </w:pPr>
+            <w:r>
+              <w:t>17 (7.0%)</w:t>
+            </w:r>
+          </w:p>
+        </w:tc>
+        <w:tc>
+          <w:p>
+            <w:pPr>
+              <w:pStyle w:stlname="Normal" w:val="Normal"/>
+            </w:pPr>
+            <w:r>
+              <w:t>26 (6.8%)</w:t>
+            </w:r>
+          </w:p>
+        </w:tc>
+        <w:tc>
+          <w:p>
+            <w:pPr>
+              <w:pStyle w:stlname="Normal" w:val="Normal"/>
+            </w:pPr>
+            <w:r>
+              <w:t>1.00e+00</w:t>
+            </w:r>
+          </w:p>
+        </w:tc>
+        <w:tc>
+          <w:p>
+            <w:pPr>
+              <w:pStyle w:stlname="Normal" w:val="Normal"/>
+            </w:pPr>
+            <w:r>
+              <w:t>1.00e+00</w:t>
             </w:r>
           </w:p>
         </w:tc>
@@ -398,57 +348,47 @@
               <w:pStyle w:stlname="Normal" w:val="Normal"/>
             </w:pPr>
             <w:r>
-              <w:t>63 (10%)</w:t>
-            </w:r>
-          </w:p>
-        </w:tc>
-        <w:tc>
-          <w:p>
-            <w:pPr>
-              <w:pStyle w:stlname="Normal" w:val="Normal"/>
-            </w:pPr>
-            <w:r>
-              <w:t>43 ( 9.2%)</w:t>
-            </w:r>
-          </w:p>
-        </w:tc>
-        <w:tc>
-          <w:p>
-            <w:pPr>
-              <w:pStyle w:stlname="Normal" w:val="Normal"/>
-            </w:pPr>
-            <w:r>
-              <w:t>17 (10.6%)</w:t>
-            </w:r>
-          </w:p>
-        </w:tc>
-        <w:tc>
-          <w:p>
-            <w:pPr>
-              <w:pStyle w:stlname="Normal" w:val="Normal"/>
-            </w:pPr>
-            <w:r>
-              <w:t>3 (20.0%)</w:t>
-            </w:r>
-          </w:p>
-        </w:tc>
-        <w:tc>
-          <w:p>
-            <w:pPr>
-              <w:pStyle w:stlname="Normal" w:val="Normal"/>
-            </w:pPr>
-            <w:r>
-              <w:t>2.77e-01</w:t>
-            </w:r>
-          </w:p>
-        </w:tc>
-        <w:tc>
-          <w:p>
-            <w:pPr>
-              <w:pStyle w:stlname="Normal" w:val="Normal"/>
-            </w:pPr>
-            <w:r>
-              <w:t>3.46e-01</w:t>
+              <w:t>61 (10%)</w:t>
+            </w:r>
+          </w:p>
+        </w:tc>
+        <w:tc>
+          <w:p>
+            <w:pPr>
+              <w:pStyle w:stlname="Normal" w:val="Normal"/>
+            </w:pPr>
+            <w:r>
+              <w:t>23 ( 9.4%)</w:t>
+            </w:r>
+          </w:p>
+        </w:tc>
+        <w:tc>
+          <w:p>
+            <w:pPr>
+              <w:pStyle w:stlname="Normal" w:val="Normal"/>
+            </w:pPr>
+            <w:r>
+              <w:t>38 (10.0%)</w:t>
+            </w:r>
+          </w:p>
+        </w:tc>
+        <w:tc>
+          <w:p>
+            <w:pPr>
+              <w:pStyle w:stlname="Normal" w:val="Normal"/>
+            </w:pPr>
+            <w:r>
+              <w:t>8.91e-01</w:t>
+            </w:r>
+          </w:p>
+        </w:tc>
+        <w:tc>
+          <w:p>
+            <w:pPr>
+              <w:pStyle w:stlname="Normal" w:val="Normal"/>
+            </w:pPr>
+            <w:r>
+              <w:t>9.90e-01</w:t>
             </w:r>
           </w:p>
         </w:tc>
@@ -470,57 +410,47 @@
               <w:pStyle w:stlname="Normal" w:val="Normal"/>
             </w:pPr>
             <w:r>
-              <w:t>208 (32%)</w:t>
-            </w:r>
-          </w:p>
-        </w:tc>
-        <w:tc>
-          <w:p>
-            <w:pPr>
-              <w:pStyle w:stlname="Normal" w:val="Normal"/>
-            </w:pPr>
-            <w:r>
-              <w:t>181 (38.6%)</w:t>
-            </w:r>
-          </w:p>
-        </w:tc>
-        <w:tc>
-          <w:p>
-            <w:pPr>
-              <w:pStyle w:stlname="Normal" w:val="Normal"/>
-            </w:pPr>
-            <w:r>
-              <w:t>23 (14.4%)</w:t>
-            </w:r>
-          </w:p>
-        </w:tc>
-        <w:tc>
-          <w:p>
-            <w:pPr>
-              <w:pStyle w:stlname="Normal" w:val="Normal"/>
-            </w:pPr>
-            <w:r>
-              <w:t>4 (26.7%)</w:t>
-            </w:r>
-          </w:p>
-        </w:tc>
-        <w:tc>
-          <w:p>
-            <w:pPr>
-              <w:pStyle w:stlname="Normal" w:val="Normal"/>
-            </w:pPr>
-            <w:r>
-              <w:t>1.33e-08</w:t>
-            </w:r>
-          </w:p>
-        </w:tc>
-        <w:tc>
-          <w:p>
-            <w:pPr>
-              <w:pStyle w:stlname="Normal" w:val="Normal"/>
-            </w:pPr>
-            <w:r>
-              <w:t>6.65e-08</w:t>
+              <w:t>205 (33%)</w:t>
+            </w:r>
+          </w:p>
+        </w:tc>
+        <w:tc>
+          <w:p>
+            <w:pPr>
+              <w:pStyle w:stlname="Normal" w:val="Normal"/>
+            </w:pPr>
+            <w:r>
+              <w:t>77 (31.6%)</w:t>
+            </w:r>
+          </w:p>
+        </w:tc>
+        <w:tc>
+          <w:p>
+            <w:pPr>
+              <w:pStyle w:stlname="Normal" w:val="Normal"/>
+            </w:pPr>
+            <w:r>
+              <w:t>128 (33.6%)</w:t>
+            </w:r>
+          </w:p>
+        </w:tc>
+        <w:tc>
+          <w:p>
+            <w:pPr>
+              <w:pStyle w:stlname="Normal" w:val="Normal"/>
+            </w:pPr>
+            <w:r>
+              <w:t>6.62e-01</w:t>
+            </w:r>
+          </w:p>
+        </w:tc>
+        <w:tc>
+          <w:p>
+            <w:pPr>
+              <w:pStyle w:stlname="Normal" w:val="Normal"/>
+            </w:pPr>
+            <w:r>
+              <w:t>9.46e-01</w:t>
             </w:r>
           </w:p>
         </w:tc>
@@ -542,57 +472,47 @@
               <w:pStyle w:stlname="Normal" w:val="Normal"/>
             </w:pPr>
             <w:r>
-              <w:t>40 ( 6%)</w:t>
-            </w:r>
-          </w:p>
-        </w:tc>
-        <w:tc>
-          <w:p>
-            <w:pPr>
-              <w:pStyle w:stlname="Normal" w:val="Normal"/>
-            </w:pPr>
-            <w:r>
-              <w:t>26 (5.5%)</w:t>
-            </w:r>
-          </w:p>
-        </w:tc>
-        <w:tc>
-          <w:p>
-            <w:pPr>
-              <w:pStyle w:stlname="Normal" w:val="Normal"/>
-            </w:pPr>
-            <w:r>
-              <w:t>13 (8.1%)</w:t>
-            </w:r>
-          </w:p>
-        </w:tc>
-        <w:tc>
-          <w:p>
-            <w:pPr>
-              <w:pStyle w:stlname="Normal" w:val="Normal"/>
-            </w:pPr>
-            <w:r>
-              <w:t>1 (6.7%)</w:t>
-            </w:r>
-          </w:p>
-        </w:tc>
-        <w:tc>
-          <w:p>
-            <w:pPr>
-              <w:pStyle w:stlname="Normal" w:val="Normal"/>
-            </w:pPr>
-            <w:r>
-              <w:t>4.07e-01</w:t>
-            </w:r>
-          </w:p>
-        </w:tc>
-        <w:tc>
-          <w:p>
-            <w:pPr>
-              <w:pStyle w:stlname="Normal" w:val="Normal"/>
-            </w:pPr>
-            <w:r>
-              <w:t>4.52e-01</w:t>
+              <w:t>38 ( 6%)</w:t>
+            </w:r>
+          </w:p>
+        </w:tc>
+        <w:tc>
+          <w:p>
+            <w:pPr>
+              <w:pStyle w:stlname="Normal" w:val="Normal"/>
+            </w:pPr>
+            <w:r>
+              <w:t>18 (7.4%)</w:t>
+            </w:r>
+          </w:p>
+        </w:tc>
+        <w:tc>
+          <w:p>
+            <w:pPr>
+              <w:pStyle w:stlname="Normal" w:val="Normal"/>
+            </w:pPr>
+            <w:r>
+              <w:t>20 (5.2%)</w:t>
+            </w:r>
+          </w:p>
+        </w:tc>
+        <w:tc>
+          <w:p>
+            <w:pPr>
+              <w:pStyle w:stlname="Normal" w:val="Normal"/>
+            </w:pPr>
+            <w:r>
+              <w:t>3.05e-01</w:t>
+            </w:r>
+          </w:p>
+        </w:tc>
+        <w:tc>
+          <w:p>
+            <w:pPr>
+              <w:pStyle w:stlname="Normal" w:val="Normal"/>
+            </w:pPr>
+            <w:r>
+              <w:t>6.10e-01</w:t>
             </w:r>
           </w:p>
         </w:tc>
@@ -624,47 +544,37 @@
               <w:pStyle w:stlname="Normal" w:val="Normal"/>
             </w:pPr>
             <w:r>
-              <w:t>22 (4.7%)</w:t>
-            </w:r>
-          </w:p>
-        </w:tc>
-        <w:tc>
-          <w:p>
-            <w:pPr>
-              <w:pStyle w:stlname="Normal" w:val="Normal"/>
-            </w:pPr>
-            <w:r>
-              <w:t>14 (8.8%)</w:t>
-            </w:r>
-          </w:p>
-        </w:tc>
-        <w:tc>
-          <w:p>
-            <w:pPr>
-              <w:pStyle w:stlname="Normal" w:val="Normal"/>
-            </w:pPr>
-            <w:r>
-              <w:t>1 (6.7%)</w:t>
-            </w:r>
-          </w:p>
-        </w:tc>
-        <w:tc>
-          <w:p>
-            <w:pPr>
-              <w:pStyle w:stlname="Normal" w:val="Normal"/>
-            </w:pPr>
-            <w:r>
-              <w:t>1.24e-01</w:t>
-            </w:r>
-          </w:p>
-        </w:tc>
-        <w:tc>
-          <w:p>
-            <w:pPr>
-              <w:pStyle w:stlname="Normal" w:val="Normal"/>
-            </w:pPr>
-            <w:r>
-              <w:t>2.18e-01</w:t>
+              <w:t>19 (7.8%)</w:t>
+            </w:r>
+          </w:p>
+        </w:tc>
+        <w:tc>
+          <w:p>
+            <w:pPr>
+              <w:pStyle w:stlname="Normal" w:val="Normal"/>
+            </w:pPr>
+            <w:r>
+              <w:t>18 (4.7%)</w:t>
+            </w:r>
+          </w:p>
+        </w:tc>
+        <w:tc>
+          <w:p>
+            <w:pPr>
+              <w:pStyle w:stlname="Normal" w:val="Normal"/>
+            </w:pPr>
+            <w:r>
+              <w:t>1.21e-01</w:t>
+            </w:r>
+          </w:p>
+        </w:tc>
+        <w:tc>
+          <w:p>
+            <w:pPr>
+              <w:pStyle w:stlname="Normal" w:val="Normal"/>
+            </w:pPr>
+            <w:r>
+              <w:t>5.65e-01</w:t>
             </w:r>
           </w:p>
         </w:tc>
@@ -686,57 +596,47 @@
               <w:pStyle w:stlname="Normal" w:val="Normal"/>
             </w:pPr>
             <w:r>
-              <w:t>172 (27%)</w:t>
-            </w:r>
-          </w:p>
-        </w:tc>
-        <w:tc>
-          <w:p>
-            <w:pPr>
-              <w:pStyle w:stlname="Normal" w:val="Normal"/>
-            </w:pPr>
-            <w:r>
-              <w:t>67 (14.3%)</w:t>
-            </w:r>
-          </w:p>
-        </w:tc>
-        <w:tc>
-          <w:p>
-            <w:pPr>
-              <w:pStyle w:stlname="Normal" w:val="Normal"/>
-            </w:pPr>
-            <w:r>
-              <w:t>103 (64.4%)</w:t>
-            </w:r>
-          </w:p>
-        </w:tc>
-        <w:tc>
-          <w:p>
-            <w:pPr>
-              <w:pStyle w:stlname="Normal" w:val="Normal"/>
-            </w:pPr>
-            <w:r>
-              <w:t>2 (13.3%)</w:t>
-            </w:r>
-          </w:p>
-        </w:tc>
-        <w:tc>
-          <w:p>
-            <w:pPr>
-              <w:pStyle w:stlname="Normal" w:val="Normal"/>
-            </w:pPr>
-            <w:r>
-              <w:t>2.23e-32</w:t>
-            </w:r>
-          </w:p>
-        </w:tc>
-        <w:tc>
-          <w:p>
-            <w:pPr>
-              <w:pStyle w:stlname="Normal" w:val="Normal"/>
-            </w:pPr>
-            <w:r>
-              <w:t>2.23e-31</w:t>
+              <w:t>171 (27%)</w:t>
+            </w:r>
+          </w:p>
+        </w:tc>
+        <w:tc>
+          <w:p>
+            <w:pPr>
+              <w:pStyle w:stlname="Normal" w:val="Normal"/>
+            </w:pPr>
+            <w:r>
+              <w:t>103 (42.2%)</w:t>
+            </w:r>
+          </w:p>
+        </w:tc>
+        <w:tc>
+          <w:p>
+            <w:pPr>
+              <w:pStyle w:stlname="Normal" w:val="Normal"/>
+            </w:pPr>
+            <w:r>
+              <w:t>68 (17.8%)</w:t>
+            </w:r>
+          </w:p>
+        </w:tc>
+        <w:tc>
+          <w:p>
+            <w:pPr>
+              <w:pStyle w:stlname="Normal" w:val="Normal"/>
+            </w:pPr>
+            <w:r>
+              <w:t>4.31e-11</w:t>
+            </w:r>
+          </w:p>
+        </w:tc>
+        <w:tc>
+          <w:p>
+            <w:pPr>
+              <w:pStyle w:stlname="Normal" w:val="Normal"/>
+            </w:pPr>
+            <w:r>
+              <w:t>4.31e-10</w:t>
             </w:r>
           </w:p>
         </w:tc>
@@ -758,57 +658,47 @@
               <w:pStyle w:stlname="Normal" w:val="Normal"/>
             </w:pPr>
             <w:r>
-              <w:t>107 (17%)</w:t>
-            </w:r>
-          </w:p>
-        </w:tc>
-        <w:tc>
-          <w:p>
-            <w:pPr>
-              <w:pStyle w:stlname="Normal" w:val="Normal"/>
-            </w:pPr>
-            <w:r>
-              <w:t>70 (14.9%)</w:t>
-            </w:r>
-          </w:p>
-        </w:tc>
-        <w:tc>
-          <w:p>
-            <w:pPr>
-              <w:pStyle w:stlname="Normal" w:val="Normal"/>
-            </w:pPr>
-            <w:r>
-              <w:t>34 (21.2%)</w:t>
-            </w:r>
-          </w:p>
-        </w:tc>
-        <w:tc>
-          <w:p>
-            <w:pPr>
-              <w:pStyle w:stlname="Normal" w:val="Normal"/>
-            </w:pPr>
-            <w:r>
-              <w:t>3 (20.0%)</w:t>
-            </w:r>
-          </w:p>
-        </w:tc>
-        <w:tc>
-          <w:p>
-            <w:pPr>
-              <w:pStyle w:stlname="Normal" w:val="Normal"/>
-            </w:pPr>
-            <w:r>
-              <w:t>1.31e-01</w:t>
-            </w:r>
-          </w:p>
-        </w:tc>
-        <w:tc>
-          <w:p>
-            <w:pPr>
-              <w:pStyle w:stlname="Normal" w:val="Normal"/>
-            </w:pPr>
-            <w:r>
-              <w:t>2.18e-01</w:t>
+              <w:t>102 (16%)</w:t>
+            </w:r>
+          </w:p>
+        </w:tc>
+        <w:tc>
+          <w:p>
+            <w:pPr>
+              <w:pStyle w:stlname="Normal" w:val="Normal"/>
+            </w:pPr>
+            <w:r>
+              <w:t>46 (18.9%)</w:t>
+            </w:r>
+          </w:p>
+        </w:tc>
+        <w:tc>
+          <w:p>
+            <w:pPr>
+              <w:pStyle w:stlname="Normal" w:val="Normal"/>
+            </w:pPr>
+            <w:r>
+              <w:t>56 (14.7%)</w:t>
+            </w:r>
+          </w:p>
+        </w:tc>
+        <w:tc>
+          <w:p>
+            <w:pPr>
+              <w:pStyle w:stlname="Normal" w:val="Normal"/>
+            </w:pPr>
+            <w:r>
+              <w:t>1.84e-01</w:t>
+            </w:r>
+          </w:p>
+        </w:tc>
+        <w:tc>
+          <w:p>
+            <w:pPr>
+              <w:pStyle w:stlname="Normal" w:val="Normal"/>
+            </w:pPr>
+            <w:r>
+              <w:t>5.65e-01</w:t>
             </w:r>
           </w:p>
         </w:tc>

</xml_diff>